<commit_message>
Show only the token total; name Mr. Hotchkiss; add Pages deploy
- Replace the per-version token table with the total and a link to
  the public repository
- Refer to Mr. Hotchkiss by name instead of "your teacher"
- GitHub Actions workflow that publishes app/ to GitHub Pages

Co-Authored-By: Claude Opus 5.5 <noreply@anthropic.com>
</commit_message>
<xml_diff>
--- a/handouts/alternative-assignment.docx
+++ b/handouts/alternative-assignment.docx
@@ -108,7 +108,7 @@
           <w:sz w:val="22"/>
           <w:szCs w:val="22"/>
         </w:rPr>
-        <w:t xml:space="preserve">Keep a research log as you go (at the end of this document). At the end, you'll present what you found to your teacher, in whatever format suits you.</w:t>
+        <w:t xml:space="preserve">Keep a research log as you go (at the end of this document). At the end, you'll present what you found to Mr. Hotchkiss, in whatever format suits you.</w:t>
       </w:r>
     </w:p>
     <w:p>
@@ -168,7 +168,7 @@
         </w:numPr>
         <w:spacing w:after="80" w:line="290"/>
       </w:pPr>
-      <w:hyperlink w:history="1" r:id="rIdopwasgsad7aqrvxcxtwkj">
+      <w:hyperlink w:history="1" r:id="rIdycqfqjudm2iqdu0aysnmd">
         <w:r>
           <w:rPr>
             <w:rFonts w:ascii="Arial" w:cs="Arial" w:eastAsia="Arial" w:hAnsi="Arial"/>
@@ -199,7 +199,7 @@
         </w:numPr>
         <w:spacing w:after="80" w:line="290"/>
       </w:pPr>
-      <w:hyperlink w:history="1" r:id="rIdlxt8o6bexbdz-zq_-nkf7">
+      <w:hyperlink w:history="1" r:id="rId3duchhpfw4u8u8zqsyiu1">
         <w:r>
           <w:rPr>
             <w:rFonts w:ascii="Arial" w:cs="Arial" w:eastAsia="Arial" w:hAnsi="Arial"/>
@@ -230,7 +230,7 @@
         </w:numPr>
         <w:spacing w:after="80" w:line="290"/>
       </w:pPr>
-      <w:hyperlink w:history="1" r:id="rIdo9rxcsiyf-lrvwpxsgrr-">
+      <w:hyperlink w:history="1" r:id="rIdkfie3lsctggkxsarextac">
         <w:r>
           <w:rPr>
             <w:rFonts w:ascii="Arial" w:cs="Arial" w:eastAsia="Arial" w:hAnsi="Arial"/>
@@ -261,7 +261,7 @@
         </w:numPr>
         <w:spacing w:after="80" w:line="290"/>
       </w:pPr>
-      <w:hyperlink w:history="1" r:id="rIdauu5u7busebqwwicpt7fb">
+      <w:hyperlink w:history="1" r:id="rIdw5qfd6pyc3-qmgschej2q">
         <w:r>
           <w:rPr>
             <w:rFonts w:ascii="Arial" w:cs="Arial" w:eastAsia="Arial" w:hAnsi="Arial"/>
@@ -323,7 +323,7 @@
         </w:numPr>
         <w:spacing w:after="80" w:line="290"/>
       </w:pPr>
-      <w:hyperlink w:history="1" r:id="rId-lphkzvszohp3y88qj8to">
+      <w:hyperlink w:history="1" r:id="rIdawqgzwibvu1akxypowgut">
         <w:r>
           <w:rPr>
             <w:rFonts w:ascii="Arial" w:cs="Arial" w:eastAsia="Arial" w:hAnsi="Arial"/>
@@ -354,7 +354,7 @@
         </w:numPr>
         <w:spacing w:after="80" w:line="290"/>
       </w:pPr>
-      <w:hyperlink w:history="1" r:id="rId-iopewz3zjhrynxmx_16t">
+      <w:hyperlink w:history="1" r:id="rIdunzns76pe5uc0hj1azbtw">
         <w:r>
           <w:rPr>
             <w:rFonts w:ascii="Arial" w:cs="Arial" w:eastAsia="Arial" w:hAnsi="Arial"/>
@@ -376,7 +376,7 @@
         </w:numPr>
         <w:spacing w:after="80" w:line="290"/>
       </w:pPr>
-      <w:hyperlink w:history="1" r:id="rId-qgwwk6extrtg8rhzseip">
+      <w:hyperlink w:history="1" r:id="rIdr8b5g5xckpr6wdqodrucd">
         <w:r>
           <w:rPr>
             <w:rFonts w:ascii="Arial" w:cs="Arial" w:eastAsia="Arial" w:hAnsi="Arial"/>
@@ -438,7 +438,7 @@
         </w:numPr>
         <w:spacing w:after="80" w:line="290"/>
       </w:pPr>
-      <w:hyperlink w:history="1" r:id="rIdlaxsba9-sfrjbvmb3fks1">
+      <w:hyperlink w:history="1" r:id="rId90qtv-vtz-ahvtbf_jbxr">
         <w:r>
           <w:rPr>
             <w:rFonts w:ascii="Arial" w:cs="Arial" w:eastAsia="Arial" w:hAnsi="Arial"/>
@@ -469,7 +469,7 @@
         </w:numPr>
         <w:spacing w:after="80" w:line="290"/>
       </w:pPr>
-      <w:hyperlink w:history="1" r:id="rIdkuj12igzmzbwlhcpojjee">
+      <w:hyperlink w:history="1" r:id="rId4ptgcdqrjgzuyfipl5kgb">
         <w:r>
           <w:rPr>
             <w:rFonts w:ascii="Arial" w:cs="Arial" w:eastAsia="Arial" w:hAnsi="Arial"/>
@@ -500,7 +500,7 @@
         </w:numPr>
         <w:spacing w:after="80" w:line="290"/>
       </w:pPr>
-      <w:hyperlink w:history="1" r:id="rIdm0jhebciwkvlw6ixkhzks">
+      <w:hyperlink w:history="1" r:id="rIdfrrw8cjyqfylhjwjsn6lx">
         <w:r>
           <w:rPr>
             <w:rFonts w:ascii="Arial" w:cs="Arial" w:eastAsia="Arial" w:hAnsi="Arial"/>
@@ -553,7 +553,7 @@
         </w:numPr>
         <w:spacing w:after="80" w:line="290"/>
       </w:pPr>
-      <w:hyperlink w:history="1" r:id="rIdbf8rbbe30aag-qmp_cafh">
+      <w:hyperlink w:history="1" r:id="rIdfsiv1mmhnvhhiov5i9eib">
         <w:r>
           <w:rPr>
             <w:rFonts w:ascii="Arial" w:cs="Arial" w:eastAsia="Arial" w:hAnsi="Arial"/>
@@ -584,7 +584,7 @@
         </w:numPr>
         <w:spacing w:after="80" w:line="290"/>
       </w:pPr>
-      <w:hyperlink w:history="1" r:id="rIdm9wat89xhyyatkk91jk2m">
+      <w:hyperlink w:history="1" r:id="rId0a9qbfpxaib5ykjubjgks">
         <w:r>
           <w:rPr>
             <w:rFonts w:ascii="Arial" w:cs="Arial" w:eastAsia="Arial" w:hAnsi="Arial"/>
@@ -615,7 +615,7 @@
         </w:numPr>
         <w:spacing w:after="80" w:line="290"/>
       </w:pPr>
-      <w:hyperlink w:history="1" r:id="rIdnknxbfm_klbzujs5tvrl_">
+      <w:hyperlink w:history="1" r:id="rIdfhndssssnvl35mkfrwdn9">
         <w:r>
           <w:rPr>
             <w:rFonts w:ascii="Arial" w:cs="Arial" w:eastAsia="Arial" w:hAnsi="Arial"/>
@@ -646,7 +646,7 @@
         </w:numPr>
         <w:spacing w:after="80" w:line="290"/>
       </w:pPr>
-      <w:hyperlink w:history="1" r:id="rIdwyznvt-zjdomhzt6i_ng7">
+      <w:hyperlink w:history="1" r:id="rIdwjb-55vk8hzkzigb2qwmi">
         <w:r>
           <w:rPr>
             <w:rFonts w:ascii="Arial" w:cs="Arial" w:eastAsia="Arial" w:hAnsi="Arial"/>
@@ -668,7 +668,7 @@
         </w:numPr>
         <w:spacing w:after="80" w:line="290"/>
       </w:pPr>
-      <w:hyperlink w:history="1" r:id="rIdj7expvn4lhkmz33kxu-6e">
+      <w:hyperlink w:history="1" r:id="rIdk6gxlf_cyu8s20qq3n2s8">
         <w:r>
           <w:rPr>
             <w:rFonts w:ascii="Arial" w:cs="Arial" w:eastAsia="Arial" w:hAnsi="Arial"/>
@@ -737,7 +737,7 @@
           <w:sz w:val="22"/>
           <w:szCs w:val="22"/>
         </w:rPr>
-        <w:t xml:space="preserve">It was "vibe coded": your teacher described what they wanted in plain English, and an AI model, Claude Opus 5.5 by Anthropic, wrote the code and most of the text.</w:t>
+        <w:t xml:space="preserve">It was "vibe coded": Mr. Hotchkiss described what he wanted in plain English, and an AI model, Claude Opus 5.5 by Anthropic, wrote the code and most of the text.</w:t>
       </w:r>
     </w:p>
     <w:p>
@@ -806,7 +806,7 @@
         </w:numPr>
         <w:spacing w:after="80" w:line="290"/>
       </w:pPr>
-      <w:hyperlink w:history="1" r:id="rIdhdojjrfmquewycjn0u7ai">
+      <w:hyperlink w:history="1" r:id="rIdhg7qtvtostlwozvlxsw8n">
         <w:r>
           <w:rPr>
             <w:rFonts w:ascii="Arial" w:cs="Arial" w:eastAsia="Arial" w:hAnsi="Arial"/>
@@ -837,7 +837,7 @@
         </w:numPr>
         <w:spacing w:after="80" w:line="290"/>
       </w:pPr>
-      <w:hyperlink w:history="1" r:id="rIdplbom18-sidgj3yilzyb8">
+      <w:hyperlink w:history="1" r:id="rId_9bl6us-liycxeo-ip2ob">
         <w:r>
           <w:rPr>
             <w:rFonts w:ascii="Arial" w:cs="Arial" w:eastAsia="Arial" w:hAnsi="Arial"/>
@@ -878,7 +878,7 @@
           <w:sz w:val="22"/>
           <w:szCs w:val="22"/>
         </w:rPr>
-        <w:t xml:space="preserve">By the end of the third class, present what you found to your teacher. </w:t>
+        <w:t xml:space="preserve">By the end of the third class, present what you found to Mr. Hotchkiss. </w:t>
       </w:r>
       <w:r>
         <w:rPr>
@@ -898,7 +898,7 @@
           <w:sz w:val="22"/>
           <w:szCs w:val="22"/>
         </w:rPr>
-        <w:t xml:space="preserve"> a written piece, a slide deck, a short recorded talk, a poster or infographic, or a conversation with your teacher (set up a time in advance).</w:t>
+        <w:t xml:space="preserve"> a written piece, a slide deck, a short recorded talk, a poster or infographic, or a conversation with Mr. Hotchkiss (set up a time in advance).</w:t>
       </w:r>
     </w:p>
     <w:p>

</xml_diff>